<commit_message>
booking page column added
</commit_message>
<xml_diff>
--- a/doc/DriverAppHelper.docx
+++ b/doc/DriverAppHelper.docx
@@ -2271,12 +2271,10 @@
         <w:t xml:space="preserve"> </w:t>
       </w:r>
       <w:proofErr w:type="spellStart"/>
-      <w:proofErr w:type="gramStart"/>
       <w:r>
         <w:t>package.json</w:t>
       </w:r>
       <w:proofErr w:type="spellEnd"/>
-      <w:proofErr w:type="gramEnd"/>
     </w:p>
     <w:p>
       <w:r>
@@ -3030,19 +3028,11 @@
         <w:rPr>
           <w:rFonts w:ascii="Aptos" w:hAnsi="Aptos" w:cs="Aptos"/>
         </w:rPr>
-        <w:t>─</w:t>
-      </w:r>
-      <w:proofErr w:type="gramStart"/>
-      <w:r>
-        <w:rPr>
-          <w:rFonts w:ascii="Aptos" w:hAnsi="Aptos" w:cs="Aptos"/>
-        </w:rPr>
-        <w:t>─</w:t>
+        <w:t>──</w:t>
       </w:r>
       <w:r>
         <w:t xml:space="preserve"> .env</w:t>
       </w:r>
-      <w:proofErr w:type="gramEnd"/>
     </w:p>
     <w:p>
       <w:r>
@@ -3069,12 +3059,10 @@
         <w:t xml:space="preserve">│   └── </w:t>
       </w:r>
       <w:proofErr w:type="spellStart"/>
-      <w:proofErr w:type="gramStart"/>
       <w:r>
         <w:t>package.json</w:t>
       </w:r>
       <w:proofErr w:type="spellEnd"/>
-      <w:proofErr w:type="gramEnd"/>
     </w:p>
     <w:p>
       <w:r>
@@ -3244,12 +3232,10 @@
         <w:t xml:space="preserve"> </w:t>
       </w:r>
       <w:proofErr w:type="spellStart"/>
-      <w:proofErr w:type="gramStart"/>
       <w:r>
         <w:t>drivers.json</w:t>
       </w:r>
       <w:proofErr w:type="spellEnd"/>
-      <w:proofErr w:type="gramEnd"/>
     </w:p>
     <w:p>
       <w:r>
@@ -3271,12 +3257,10 @@
         <w:t xml:space="preserve"> </w:t>
       </w:r>
       <w:proofErr w:type="spellStart"/>
-      <w:proofErr w:type="gramStart"/>
       <w:r>
         <w:t>staff.json</w:t>
       </w:r>
       <w:proofErr w:type="spellEnd"/>
-      <w:proofErr w:type="gramEnd"/>
     </w:p>
     <w:p>
       <w:r>
@@ -3437,18 +3421,13 @@
     </w:p>
     <w:p>
       <w:r>
-        <w:t>└─</w:t>
-      </w:r>
-      <w:proofErr w:type="gramStart"/>
-      <w:r>
-        <w:t>─ .</w:t>
+        <w:t>└── .</w:t>
       </w:r>
       <w:proofErr w:type="spellStart"/>
       <w:r>
         <w:t>gitignore</w:t>
       </w:r>
       <w:proofErr w:type="spellEnd"/>
-      <w:proofErr w:type="gramEnd"/>
     </w:p>
     <w:p>
       <w:r>
@@ -4127,6 +4106,102 @@
     <w:p>
       <w:r>
         <w:t>- and a working booking flow.</w:t>
+      </w:r>
+    </w:p>
+    <w:p/>
+    <w:p/>
+    <w:p/>
+    <w:p>
+      <w:r>
+        <w:t xml:space="preserve">here the thing is while running [client](http://localhost:5173/) firstly it look like admin </w:t>
+      </w:r>
+      <w:proofErr w:type="spellStart"/>
+      <w:r>
+        <w:t>logined</w:t>
+      </w:r>
+      <w:proofErr w:type="spellEnd"/>
+      <w:r>
+        <w:t xml:space="preserve"> in. </w:t>
+      </w:r>
+      <w:proofErr w:type="spellStart"/>
+      <w:r>
+        <w:t>i</w:t>
+      </w:r>
+      <w:proofErr w:type="spellEnd"/>
+      <w:r>
+        <w:t xml:space="preserve"> </w:t>
+      </w:r>
+      <w:proofErr w:type="spellStart"/>
+      <w:r>
+        <w:t>dont</w:t>
+      </w:r>
+      <w:proofErr w:type="spellEnd"/>
+      <w:r>
+        <w:t xml:space="preserve"> need that </w:t>
+      </w:r>
+      <w:proofErr w:type="spellStart"/>
+      <w:r>
+        <w:t>one.i</w:t>
+      </w:r>
+      <w:proofErr w:type="spellEnd"/>
+      <w:r>
+        <w:t xml:space="preserve"> need to see login page. then based on login </w:t>
+      </w:r>
+      <w:proofErr w:type="spellStart"/>
+      <w:r>
+        <w:t>i</w:t>
+      </w:r>
+      <w:proofErr w:type="spellEnd"/>
+      <w:r>
+        <w:t xml:space="preserve"> need to see the main page. admin inbuilt user name is email: "</w:t>
+      </w:r>
+      <w:proofErr w:type="spellStart"/>
+      <w:r>
+        <w:t>admin@driverbooking</w:t>
+      </w:r>
+      <w:proofErr w:type="spellEnd"/>
+      <w:r>
+        <w:t xml:space="preserve">", password: "admin123" if am login with this ids then </w:t>
+      </w:r>
+      <w:proofErr w:type="spellStart"/>
+      <w:r>
+        <w:t>i</w:t>
+      </w:r>
+      <w:proofErr w:type="spellEnd"/>
+      <w:r>
+        <w:t xml:space="preserve"> can see admin related things. then while registering we have 2 options like worker and user. in user need  relevant information and in worker also we need relevant information. also while registering </w:t>
+      </w:r>
+      <w:proofErr w:type="spellStart"/>
+      <w:r>
+        <w:t>tyhe</w:t>
+      </w:r>
+      <w:proofErr w:type="spellEnd"/>
+      <w:r>
+        <w:t xml:space="preserve"> platform we need </w:t>
+      </w:r>
+      <w:proofErr w:type="spellStart"/>
+      <w:r>
+        <w:t>otp</w:t>
+      </w:r>
+      <w:proofErr w:type="spellEnd"/>
+      <w:r>
+        <w:t xml:space="preserve"> verification. after </w:t>
+      </w:r>
+      <w:proofErr w:type="spellStart"/>
+      <w:r>
+        <w:t>otp</w:t>
+      </w:r>
+      <w:proofErr w:type="spellEnd"/>
+      <w:r>
+        <w:t xml:space="preserve"> matches then user or worker should create the username and password then login with username and password. based on user need to show dashboard or main page like user can see booking and my booking payment et. driver can see available or possible booking , mapping details, money </w:t>
+      </w:r>
+      <w:proofErr w:type="spellStart"/>
+      <w:r>
+        <w:t>mangements</w:t>
+      </w:r>
+      <w:proofErr w:type="spellEnd"/>
+      <w:r>
+        <w:t>, daily collection of that particular worker and monthly amount etc. just think like a developer</w:t>
       </w:r>
     </w:p>
     <w:sectPr>
@@ -4742,6 +4817,7 @@
   <w:style w:type="character" w:default="1" w:styleId="DefaultParagraphFont">
     <w:name w:val="Default Paragraph Font"/>
     <w:uiPriority w:val="1"/>
+    <w:semiHidden/>
     <w:unhideWhenUsed/>
   </w:style>
   <w:style w:type="table" w:default="1" w:styleId="TableNormal">

</xml_diff>